<commit_message>
Deploy preview for PR 666 🛫
</commit_message>
<xml_diff>
--- a/pr-preview/pr-666/vignettes/articles/version-crosswalk-1.3-to-1.4.docx
+++ b/pr-preview/pr-666/vignettes/articles/version-crosswalk-1.3-to-1.4.docx
@@ -23,7 +23,7 @@
         <w:pStyle w:val="Date"/>
       </w:pPr>
       <w:r>
-        <w:t xml:space="preserve">2026-08-26</w:t>
+        <w:t xml:space="preserve">2026-09-09</w:t>
       </w:r>
     </w:p>
     <w:bookmarkStart w:id="9" w:name="overview"/>
@@ -3067,7 +3067,7 @@
         <w:rPr>
           <w:rStyle w:val="CommentTok"/>
         </w:rPr>
-        <w:t xml:space="preserve">#&gt; 1  0.12 1     HlyE_IgA      0.853</w:t>
+        <w:t xml:space="preserve">#&gt; 1  5.51 1     HlyE_IgA      0.613</w:t>
       </w:r>
       <w:r>
         <w:br/>
@@ -3076,7 +3076,7 @@
         <w:rPr>
           <w:rStyle w:val="CommentTok"/>
         </w:rPr>
-        <w:t xml:space="preserve">#&gt; 2  0.12 1     HlyE_IgG      0.570</w:t>
+        <w:t xml:space="preserve">#&gt; 2  5.51 1     HlyE_IgG      0.533</w:t>
       </w:r>
       <w:r>
         <w:br/>
@@ -3085,7 +3085,7 @@
         <w:rPr>
           <w:rStyle w:val="CommentTok"/>
         </w:rPr>
-        <w:t xml:space="preserve">#&gt; 3 13.9  2     HlyE_IgA      0.685</w:t>
+        <w:t xml:space="preserve">#&gt; 3 11.1  2     HlyE_IgA      0.549</w:t>
       </w:r>
       <w:r>
         <w:br/>
@@ -3094,7 +3094,7 @@
         <w:rPr>
           <w:rStyle w:val="CommentTok"/>
         </w:rPr>
-        <w:t xml:space="preserve">#&gt; 4 13.9  2     HlyE_IgG      1.80 </w:t>
+        <w:t xml:space="preserve">#&gt; 4 11.1  2     HlyE_IgG      0.635</w:t>
       </w:r>
       <w:r>
         <w:br/>
@@ -3103,7 +3103,7 @@
         <w:rPr>
           <w:rStyle w:val="CommentTok"/>
         </w:rPr>
-        <w:t xml:space="preserve">#&gt; 5  6.67 3     HlyE_IgA     33.0  </w:t>
+        <w:t xml:space="preserve">#&gt; 5 18.2  3     HlyE_IgA    162.   </w:t>
       </w:r>
       <w:r>
         <w:br/>
@@ -3112,7 +3112,7 @@
         <w:rPr>
           <w:rStyle w:val="CommentTok"/>
         </w:rPr>
-        <w:t xml:space="preserve">#&gt; 6  6.67 3     HlyE_IgG    379.</w:t>
+        <w:t xml:space="preserve">#&gt; 6 18.2  3     HlyE_IgG     86.5</w:t>
       </w:r>
       <w:r>
         <w:br/>

</xml_diff>